<commit_message>
Versión 2, con bitacora de depuración
</commit_message>
<xml_diff>
--- a/docs/Informe Iteración 2 Extensión 1 - Aegerter Sebastián.docx
+++ b/docs/Informe Iteración 2 Extensión 1 - Aegerter Sebastián.docx
@@ -101,26 +101,26 @@
           <w:szCs w:val="24"/>
           <w:rtl w:val="0"/>
         </w:rPr>
-        <w:t xml:space="preserve">Corrección:</w:t>
-      </w:r>
-    </w:p>
-    <w:p>
-      <w:pPr>
-        <w:spacing w:after="240" w:before="240" w:line="279" w:lineRule="auto"/>
-        <w:rPr>
-          <w:rFonts w:ascii="Aptos" w:cs="Aptos" w:eastAsia="Aptos" w:hAnsi="Aptos"/>
-          <w:sz w:val="24"/>
-          <w:szCs w:val="24"/>
-        </w:rPr>
-      </w:pPr>
-      <w:r>
-        <w:rPr>
-          <w:rFonts w:ascii="Aptos" w:cs="Aptos" w:eastAsia="Aptos" w:hAnsi="Aptos"/>
-          <w:sz w:val="24"/>
-          <w:szCs w:val="24"/>
-          <w:rtl w:val="0"/>
-        </w:rPr>
-        <w:t xml:space="preserve">-En el requerimiento 2  </w:t>
+        <w:t xml:space="preserve">Problema detectado: </w:t>
+      </w:r>
+    </w:p>
+    <w:p>
+      <w:pPr>
+        <w:spacing w:after="240" w:before="240" w:line="279" w:lineRule="auto"/>
+        <w:rPr>
+          <w:rFonts w:ascii="Aptos" w:cs="Aptos" w:eastAsia="Aptos" w:hAnsi="Aptos"/>
+          <w:sz w:val="24"/>
+          <w:szCs w:val="24"/>
+        </w:rPr>
+      </w:pPr>
+      <w:r>
+        <w:rPr>
+          <w:rFonts w:ascii="Aptos" w:cs="Aptos" w:eastAsia="Aptos" w:hAnsi="Aptos"/>
+          <w:sz w:val="24"/>
+          <w:szCs w:val="24"/>
+          <w:rtl w:val="0"/>
+        </w:rPr>
+        <w:t xml:space="preserve">Durante la realización de la extensión ocurrió un error con la función de </w:t>
       </w:r>
       <w:r>
         <w:rPr>
@@ -138,22 +138,11 @@
       <w:r>
         <w:rPr>
           <w:rFonts w:ascii="Aptos" w:cs="Aptos" w:eastAsia="Aptos" w:hAnsi="Aptos"/>
-          <w:i w:val="1"/>
-          <w:iCs w:val="1"/>
-          <w:sz w:val="24"/>
-          <w:szCs w:val="24"/>
-          <w:rtl w:val="0"/>
-        </w:rPr>
-        <w:t xml:space="preserve"> </w:t>
-      </w:r>
-      <w:r>
-        <w:rPr>
-          <w:rFonts w:ascii="Aptos" w:cs="Aptos" w:eastAsia="Aptos" w:hAnsi="Aptos"/>
-          <w:sz w:val="24"/>
-          <w:szCs w:val="24"/>
-          <w:rtl w:val="0"/>
-        </w:rPr>
-        <w:t xml:space="preserve">se añadieron las transiciones a los colores intermitentes</w:t>
+          <w:sz w:val="24"/>
+          <w:szCs w:val="24"/>
+          <w:rtl w:val="0"/>
+        </w:rPr>
+        <w:t xml:space="preserve">, que no devolvió la lista con el nombre de “cambiar-a-&lt;color&gt;” especificado en la consigna;</w:t>
       </w:r>
     </w:p>
     <w:p>
@@ -173,14 +162,14 @@
         </w:rPr>
         <w:drawing>
           <wp:inline distB="114300" distT="114300" distL="114300" distR="114300">
-            <wp:extent cx="5731200" cy="1447800"/>
+            <wp:extent cx="5731200" cy="1498600"/>
             <wp:effectExtent b="0" l="0" r="0" t="0"/>
-            <wp:docPr id="1" name="image3.png"/>
+            <wp:docPr id="1" name="image5.png"/>
             <a:graphic>
               <a:graphicData uri="http://schemas.openxmlformats.org/drawingml/2006/picture">
                 <pic:pic>
                   <pic:nvPicPr>
-                    <pic:cNvPr id="0" name="image3.png"/>
+                    <pic:cNvPr id="0" name="image5.png"/>
                     <pic:cNvPicPr preferRelativeResize="0"/>
                   </pic:nvPicPr>
                   <pic:blipFill>
@@ -193,7 +182,7 @@
                   <pic:spPr>
                     <a:xfrm>
                       <a:off x="0" y="0"/>
-                      <a:ext cx="5731200" cy="1447800"/>
+                      <a:ext cx="5731200" cy="1498600"/>
                     </a:xfrm>
                     <a:prstGeom prst="rect"/>
                     <a:ln/>
@@ -214,38 +203,44 @@
       <w:pPr>
         <w:spacing w:after="240" w:before="240" w:line="279" w:lineRule="auto"/>
         <w:rPr>
-          <w:rFonts w:ascii="Aptos" w:cs="Aptos" w:eastAsia="Aptos" w:hAnsi="Aptos"/>
-          <w:sz w:val="24"/>
-          <w:szCs w:val="24"/>
-        </w:rPr>
-      </w:pPr>
-      <w:r>
-        <w:rPr>
-          <w:rtl w:val="0"/>
-        </w:rPr>
-      </w:r>
-    </w:p>
-    <w:p>
-      <w:pPr>
-        <w:spacing w:after="240" w:before="240" w:line="279" w:lineRule="auto"/>
-        <w:rPr>
-          <w:rFonts w:ascii="Aptos" w:cs="Aptos" w:eastAsia="Aptos" w:hAnsi="Aptos"/>
-          <w:sz w:val="24"/>
-          <w:szCs w:val="24"/>
-        </w:rPr>
-      </w:pPr>
-      <w:r>
-        <w:rPr>
-          <w:rFonts w:ascii="Aptos" w:cs="Aptos" w:eastAsia="Aptos" w:hAnsi="Aptos"/>
-          <w:sz w:val="24"/>
-          <w:szCs w:val="24"/>
-          <w:rtl w:val="0"/>
-        </w:rPr>
-        <w:t xml:space="preserve">-En el requerimiento 3  </w:t>
-      </w:r>
-      <w:r>
-        <w:rPr>
-          <w:rFonts w:ascii="Aptos" w:cs="Aptos" w:eastAsia="Aptos" w:hAnsi="Aptos"/>
+          <w:sz w:val="24"/>
+          <w:szCs w:val="24"/>
+        </w:rPr>
+      </w:pPr>
+      <w:r>
+        <w:rPr>
+          <w:b w:val="1"/>
+          <w:bCs w:val="1"/>
+          <w:sz w:val="24"/>
+          <w:szCs w:val="24"/>
+          <w:rtl w:val="0"/>
+        </w:rPr>
+        <w:t xml:space="preserve">Causa del error: </w:t>
+      </w:r>
+      <w:r>
+        <w:rPr>
+          <w:rtl w:val="0"/>
+        </w:rPr>
+      </w:r>
+    </w:p>
+    <w:p>
+      <w:pPr>
+        <w:spacing w:after="240" w:before="240" w:line="279" w:lineRule="auto"/>
+        <w:rPr>
+          <w:sz w:val="24"/>
+          <w:szCs w:val="24"/>
+        </w:rPr>
+      </w:pPr>
+      <w:r>
+        <w:rPr>
+          <w:sz w:val="24"/>
+          <w:szCs w:val="24"/>
+          <w:rtl w:val="0"/>
+        </w:rPr>
+        <w:t xml:space="preserve">Durante la implementación de las intermitencias se modificaron los estados del semáforo, sin embargo, la función </w:t>
+      </w:r>
+      <w:r>
+        <w:rPr>
           <w:b w:val="1"/>
           <w:bCs w:val="1"/>
           <w:i w:val="1"/>
@@ -258,86 +253,255 @@
       </w:r>
       <w:r>
         <w:rPr>
-          <w:rFonts w:ascii="Aptos" w:cs="Aptos" w:eastAsia="Aptos" w:hAnsi="Aptos"/>
+          <w:sz w:val="24"/>
+          <w:szCs w:val="24"/>
+          <w:rtl w:val="0"/>
+        </w:rPr>
+        <w:t xml:space="preserve"> devolvía estados con nombres </w:t>
+      </w:r>
+      <w:r>
+        <w:rPr>
+          <w:sz w:val="24"/>
+          <w:szCs w:val="24"/>
+          <w:rtl w:val="0"/>
+        </w:rPr>
+        <w:t xml:space="preserve">rojo</w:t>
+      </w:r>
+      <w:r>
+        <w:rPr>
+          <w:sz w:val="24"/>
+          <w:szCs w:val="24"/>
+          <w:rtl w:val="0"/>
+        </w:rPr>
+        <w:t xml:space="preserve">, </w:t>
+      </w:r>
+      <w:r>
+        <w:rPr>
+          <w:sz w:val="24"/>
+          <w:szCs w:val="24"/>
+          <w:rtl w:val="0"/>
+        </w:rPr>
+        <w:t xml:space="preserve">amarillo</w:t>
+      </w:r>
+      <w:r>
+        <w:rPr>
+          <w:sz w:val="24"/>
+          <w:szCs w:val="24"/>
+          <w:rtl w:val="0"/>
+        </w:rPr>
+        <w:t xml:space="preserve"> y </w:t>
+      </w:r>
+      <w:r>
+        <w:rPr>
+          <w:sz w:val="24"/>
+          <w:szCs w:val="24"/>
+          <w:rtl w:val="0"/>
+        </w:rPr>
+        <w:t xml:space="preserve">verde</w:t>
+      </w:r>
+      <w:r>
+        <w:rPr>
+          <w:sz w:val="24"/>
+          <w:szCs w:val="24"/>
+          <w:rtl w:val="0"/>
+        </w:rPr>
+        <w:t xml:space="preserve"> mientras que </w:t>
+      </w:r>
+      <w:r>
+        <w:rPr>
+          <w:b w:val="1"/>
+          <w:bCs w:val="1"/>
           <w:i w:val="1"/>
           <w:iCs w:val="1"/>
           <w:sz w:val="24"/>
           <w:szCs w:val="24"/>
           <w:rtl w:val="0"/>
         </w:rPr>
-        <w:t xml:space="preserve">  </w:t>
-      </w:r>
-      <w:r>
-        <w:rPr>
-          <w:rFonts w:ascii="Aptos" w:cs="Aptos" w:eastAsia="Aptos" w:hAnsi="Aptos"/>
-          <w:sz w:val="24"/>
-          <w:szCs w:val="24"/>
-          <w:rtl w:val="0"/>
-        </w:rPr>
-        <w:t xml:space="preserve">se añadieron los intermitentes y se sumaron los 3 segundos de cada intermitente al timestamp. </w:t>
-      </w:r>
-    </w:p>
-    <w:p>
-      <w:pPr>
-        <w:spacing w:after="240" w:before="240" w:line="279" w:lineRule="auto"/>
-        <w:rPr>
-          <w:rFonts w:ascii="Aptos" w:cs="Aptos" w:eastAsia="Aptos" w:hAnsi="Aptos"/>
-          <w:b w:val="1"/>
-          <w:bCs w:val="1"/>
-          <w:i w:val="1"/>
-          <w:iCs w:val="1"/>
-          <w:sz w:val="24"/>
-          <w:szCs w:val="24"/>
-        </w:rPr>
-      </w:pPr>
-      <w:r>
-        <w:rPr>
-          <w:rFonts w:ascii="Aptos" w:cs="Aptos" w:eastAsia="Aptos" w:hAnsi="Aptos"/>
-          <w:sz w:val="24"/>
-          <w:szCs w:val="24"/>
-          <w:rtl w:val="0"/>
-        </w:rPr>
-        <w:t xml:space="preserve">Las posiciones pasaron de </w:t>
-      </w:r>
-      <w:r>
-        <w:rPr>
-          <w:rFonts w:ascii="Aptos" w:cs="Aptos" w:eastAsia="Aptos" w:hAnsi="Aptos"/>
-          <w:b w:val="1"/>
-          <w:bCs w:val="1"/>
-          <w:i w:val="1"/>
-          <w:iCs w:val="1"/>
-          <w:sz w:val="24"/>
-          <w:szCs w:val="24"/>
-          <w:rtl w:val="0"/>
-        </w:rPr>
-        <w:t xml:space="preserve">216 -&gt; 225</w:t>
-      </w:r>
-    </w:p>
-    <w:p>
-      <w:pPr>
-        <w:spacing w:after="240" w:before="240" w:line="279" w:lineRule="auto"/>
-        <w:rPr>
-          <w:rFonts w:ascii="Aptos" w:cs="Aptos" w:eastAsia="Aptos" w:hAnsi="Aptos"/>
-          <w:sz w:val="24"/>
-          <w:szCs w:val="24"/>
-        </w:rPr>
-      </w:pPr>
-      <w:r>
-        <w:rPr>
-          <w:rFonts w:ascii="Aptos" w:cs="Aptos" w:eastAsia="Aptos" w:hAnsi="Aptos"/>
+        <w:t xml:space="preserve">validar-transiciones-p</w:t>
+      </w:r>
+      <w:r>
+        <w:rPr>
+          <w:sz w:val="24"/>
+          <w:szCs w:val="24"/>
+          <w:rtl w:val="0"/>
+        </w:rPr>
+        <w:t xml:space="preserve"> evaluaba estados con el formato </w:t>
+      </w:r>
+      <w:r>
+        <w:rPr>
+          <w:sz w:val="24"/>
+          <w:szCs w:val="24"/>
+          <w:rtl w:val="0"/>
+        </w:rPr>
+        <w:t xml:space="preserve">en-rojo</w:t>
+      </w:r>
+      <w:r>
+        <w:rPr>
+          <w:sz w:val="24"/>
+          <w:szCs w:val="24"/>
+          <w:rtl w:val="0"/>
+        </w:rPr>
+        <w:t xml:space="preserve">, </w:t>
+      </w:r>
+      <w:r>
+        <w:rPr>
+          <w:sz w:val="24"/>
+          <w:szCs w:val="24"/>
+          <w:rtl w:val="0"/>
+        </w:rPr>
+        <w:t xml:space="preserve">en-amarillo</w:t>
+      </w:r>
+      <w:r>
+        <w:rPr>
+          <w:sz w:val="24"/>
+          <w:szCs w:val="24"/>
+          <w:rtl w:val="0"/>
+        </w:rPr>
+        <w:t xml:space="preserve"> y </w:t>
+      </w:r>
+      <w:r>
+        <w:rPr>
+          <w:sz w:val="24"/>
+          <w:szCs w:val="24"/>
+          <w:rtl w:val="0"/>
+        </w:rPr>
+        <w:t xml:space="preserve">en-verde</w:t>
+      </w:r>
+      <w:r>
+        <w:rPr>
+          <w:sz w:val="24"/>
+          <w:szCs w:val="24"/>
+          <w:rtl w:val="0"/>
+        </w:rPr>
+        <w:t xml:space="preserve">. Debido a esta diferencia de nomenclatura, las comparaciones realizadas retornaban </w:t>
+      </w:r>
+      <w:r>
+        <w:rPr>
+          <w:sz w:val="24"/>
+          <w:szCs w:val="24"/>
+          <w:rtl w:val="0"/>
+        </w:rPr>
+        <w:t xml:space="preserve">NIL</w:t>
+      </w:r>
+      <w:r>
+        <w:rPr>
+          <w:sz w:val="24"/>
+          <w:szCs w:val="24"/>
+          <w:rtl w:val="0"/>
+        </w:rPr>
+        <w:t xml:space="preserve">, provocando que transiciones válidas fueran rechazadas y que la función transición no generará la acción </w:t>
+      </w:r>
+      <w:r>
+        <w:rPr>
+          <w:sz w:val="24"/>
+          <w:szCs w:val="24"/>
+          <w:rtl w:val="0"/>
+        </w:rPr>
+        <w:t xml:space="preserve">"cambiar-a-&lt;color&gt;"</w:t>
+      </w:r>
+      <w:r>
+        <w:rPr>
+          <w:sz w:val="24"/>
+          <w:szCs w:val="24"/>
+          <w:rtl w:val="0"/>
+        </w:rPr>
+        <w:t xml:space="preserve">.  </w:t>
+      </w:r>
+    </w:p>
+    <w:p>
+      <w:pPr>
+        <w:spacing w:after="240" w:before="240" w:line="279" w:lineRule="auto"/>
+        <w:rPr>
+          <w:b w:val="1"/>
+          <w:bCs w:val="1"/>
+          <w:sz w:val="24"/>
+          <w:szCs w:val="24"/>
+        </w:rPr>
+      </w:pPr>
+      <w:r>
+        <w:rPr>
+          <w:b w:val="1"/>
+          <w:bCs w:val="1"/>
+          <w:sz w:val="24"/>
+          <w:szCs w:val="24"/>
+          <w:rtl w:val="0"/>
+        </w:rPr>
+        <w:t xml:space="preserve">Solución al error:</w:t>
+      </w:r>
+    </w:p>
+    <w:p>
+      <w:pPr>
+        <w:spacing w:after="240" w:before="240" w:line="279" w:lineRule="auto"/>
+        <w:rPr>
+          <w:sz w:val="24"/>
+          <w:szCs w:val="24"/>
+        </w:rPr>
+      </w:pPr>
+      <w:r>
+        <w:rPr>
+          <w:sz w:val="24"/>
+          <w:szCs w:val="24"/>
+          <w:rtl w:val="0"/>
+        </w:rPr>
+        <w:t xml:space="preserve">Se eliminó el prefijo “en-” de las comparaciones para unificar la representación de los estados del semáforo en todo el sistema. Así los estados evaluados por dicha función coinciden con los estados retornados por </w:t>
+      </w:r>
+      <w:r>
+        <w:rPr>
+          <w:sz w:val="24"/>
+          <w:szCs w:val="24"/>
+          <w:rtl w:val="0"/>
+        </w:rPr>
+        <w:t xml:space="preserve">timer</w:t>
+      </w:r>
+      <w:r>
+        <w:rPr>
+          <w:sz w:val="24"/>
+          <w:szCs w:val="24"/>
+          <w:rtl w:val="0"/>
+        </w:rPr>
+        <w:t xml:space="preserve">, permitiendo que las transiciones válidas sean reconocidas correctamente y genere la acción correspondiente.</w:t>
+      </w:r>
+    </w:p>
+    <w:p>
+      <w:pPr>
+        <w:spacing w:after="240" w:before="240" w:line="279" w:lineRule="auto"/>
+        <w:rPr>
+          <w:sz w:val="24"/>
+          <w:szCs w:val="24"/>
+        </w:rPr>
+      </w:pPr>
+      <w:r>
+        <w:rPr>
+          <w:sz w:val="24"/>
+          <w:szCs w:val="24"/>
+          <w:rtl w:val="0"/>
+        </w:rPr>
+        <w:t xml:space="preserve">Si bien esta solución se aparta parcialmente de la nomenclatura presentada en el ejemplo de la consigna, se decidió mantener una única convención de nombres dentro del programa para garantizar la consistencia y evitar errores de comparación entre símbolos.</w:t>
+      </w:r>
+    </w:p>
+    <w:p>
+      <w:pPr>
+        <w:spacing w:after="240" w:before="240" w:line="279" w:lineRule="auto"/>
+        <w:rPr>
+          <w:sz w:val="24"/>
+          <w:szCs w:val="24"/>
+        </w:rPr>
+      </w:pPr>
+      <w:r>
+        <w:rPr>
           <w:sz w:val="24"/>
           <w:szCs w:val="24"/>
         </w:rPr>
         <w:drawing>
           <wp:inline distB="114300" distT="114300" distL="114300" distR="114300">
-            <wp:extent cx="5010150" cy="2276475"/>
+            <wp:extent cx="4805363" cy="2400300"/>
             <wp:effectExtent b="0" l="0" r="0" t="0"/>
-            <wp:docPr id="4" name="image2.png"/>
+            <wp:docPr id="6" name="image6.png"/>
             <a:graphic>
               <a:graphicData uri="http://schemas.openxmlformats.org/drawingml/2006/picture">
                 <pic:pic>
                   <pic:nvPicPr>
-                    <pic:cNvPr id="0" name="image2.png"/>
+                    <pic:cNvPr id="0" name="image6.png"/>
                     <pic:cNvPicPr preferRelativeResize="0"/>
                   </pic:nvPicPr>
                   <pic:blipFill>
@@ -350,7 +514,7 @@
                   <pic:spPr>
                     <a:xfrm>
                       <a:off x="0" y="0"/>
-                      <a:ext cx="5010150" cy="2276475"/>
+                      <a:ext cx="4805363" cy="2400300"/>
                     </a:xfrm>
                     <a:prstGeom prst="rect"/>
                     <a:ln/>
@@ -371,34 +535,71 @@
       <w:pPr>
         <w:spacing w:after="240" w:before="240" w:line="279" w:lineRule="auto"/>
         <w:rPr>
-          <w:rFonts w:ascii="Aptos" w:cs="Aptos" w:eastAsia="Aptos" w:hAnsi="Aptos"/>
-          <w:sz w:val="24"/>
-          <w:szCs w:val="24"/>
-        </w:rPr>
-      </w:pPr>
-      <w:r>
-        <w:rPr>
-          <w:rtl w:val="0"/>
-        </w:rPr>
-      </w:r>
-    </w:p>
-    <w:p>
-      <w:pPr>
-        <w:spacing w:after="240" w:before="240" w:line="279" w:lineRule="auto"/>
-        <w:rPr>
-          <w:rFonts w:ascii="Aptos" w:cs="Aptos" w:eastAsia="Aptos" w:hAnsi="Aptos"/>
-          <w:sz w:val="24"/>
-          <w:szCs w:val="24"/>
-        </w:rPr>
-      </w:pPr>
-      <w:r>
-        <w:rPr>
-          <w:rFonts w:ascii="Aptos" w:cs="Aptos" w:eastAsia="Aptos" w:hAnsi="Aptos"/>
-          <w:sz w:val="24"/>
-          <w:szCs w:val="24"/>
-          <w:rtl w:val="0"/>
-        </w:rPr>
-        <w:t xml:space="preserve">-En el requerimiento 6 </w:t>
+          <w:sz w:val="24"/>
+          <w:szCs w:val="24"/>
+        </w:rPr>
+      </w:pPr>
+      <w:r>
+        <w:rPr>
+          <w:rtl w:val="0"/>
+        </w:rPr>
+      </w:r>
+    </w:p>
+    <w:p>
+      <w:pPr>
+        <w:spacing w:after="240" w:before="240" w:line="279" w:lineRule="auto"/>
+        <w:rPr>
+          <w:rFonts w:ascii="Aptos" w:cs="Aptos" w:eastAsia="Aptos" w:hAnsi="Aptos"/>
+          <w:sz w:val="24"/>
+          <w:szCs w:val="24"/>
+        </w:rPr>
+      </w:pPr>
+      <w:r>
+        <w:rPr>
+          <w:rtl w:val="0"/>
+        </w:rPr>
+      </w:r>
+    </w:p>
+    <w:p>
+      <w:pPr>
+        <w:spacing w:after="240" w:before="240" w:line="279" w:lineRule="auto"/>
+        <w:rPr>
+          <w:rFonts w:ascii="Aptos" w:cs="Aptos" w:eastAsia="Aptos" w:hAnsi="Aptos"/>
+          <w:b w:val="1"/>
+          <w:bCs w:val="1"/>
+          <w:sz w:val="24"/>
+          <w:szCs w:val="24"/>
+        </w:rPr>
+      </w:pPr>
+      <w:r>
+        <w:rPr>
+          <w:rFonts w:ascii="Aptos" w:cs="Aptos" w:eastAsia="Aptos" w:hAnsi="Aptos"/>
+          <w:b w:val="1"/>
+          <w:bCs w:val="1"/>
+          <w:sz w:val="24"/>
+          <w:szCs w:val="24"/>
+          <w:rtl w:val="0"/>
+        </w:rPr>
+        <w:t xml:space="preserve">Corrección del código original:</w:t>
+      </w:r>
+    </w:p>
+    <w:p>
+      <w:pPr>
+        <w:spacing w:after="240" w:before="240" w:line="279" w:lineRule="auto"/>
+        <w:rPr>
+          <w:rFonts w:ascii="Aptos" w:cs="Aptos" w:eastAsia="Aptos" w:hAnsi="Aptos"/>
+          <w:sz w:val="24"/>
+          <w:szCs w:val="24"/>
+        </w:rPr>
+      </w:pPr>
+      <w:r>
+        <w:rPr>
+          <w:rFonts w:ascii="Aptos" w:cs="Aptos" w:eastAsia="Aptos" w:hAnsi="Aptos"/>
+          <w:sz w:val="24"/>
+          <w:szCs w:val="24"/>
+          <w:rtl w:val="0"/>
+        </w:rPr>
+        <w:t xml:space="preserve">-En el requerimiento 2  </w:t>
       </w:r>
       <w:r>
         <w:rPr>
@@ -411,16 +612,27 @@
           <w:szCs w:val="24"/>
           <w:rtl w:val="0"/>
         </w:rPr>
-        <w:t xml:space="preserve">distribucion-temporal </w:t>
-      </w:r>
-      <w:r>
-        <w:rPr>
-          <w:rFonts w:ascii="Aptos" w:cs="Aptos" w:eastAsia="Aptos" w:hAnsi="Aptos"/>
-          <w:sz w:val="24"/>
-          <w:szCs w:val="24"/>
-          <w:rtl w:val="0"/>
-        </w:rPr>
-        <w:t xml:space="preserve">se añadieron los 3 intermitentes para que también calcule el porcentaje de tiempo de los colores intermitentes.</w:t>
+        <w:t xml:space="preserve">validar-transiciones-p</w:t>
+      </w:r>
+      <w:r>
+        <w:rPr>
+          <w:rFonts w:ascii="Aptos" w:cs="Aptos" w:eastAsia="Aptos" w:hAnsi="Aptos"/>
+          <w:i w:val="1"/>
+          <w:iCs w:val="1"/>
+          <w:sz w:val="24"/>
+          <w:szCs w:val="24"/>
+          <w:rtl w:val="0"/>
+        </w:rPr>
+        <w:t xml:space="preserve"> </w:t>
+      </w:r>
+      <w:r>
+        <w:rPr>
+          <w:rFonts w:ascii="Aptos" w:cs="Aptos" w:eastAsia="Aptos" w:hAnsi="Aptos"/>
+          <w:sz w:val="24"/>
+          <w:szCs w:val="24"/>
+          <w:rtl w:val="0"/>
+        </w:rPr>
+        <w:t xml:space="preserve">se añadieron las transiciones a los colores intermitentes</w:t>
       </w:r>
     </w:p>
     <w:p>
@@ -440,14 +652,14 @@
         </w:rPr>
         <w:drawing>
           <wp:inline distB="114300" distT="114300" distL="114300" distR="114300">
-            <wp:extent cx="5731200" cy="6375400"/>
+            <wp:extent cx="5214938" cy="1446669"/>
             <wp:effectExtent b="0" l="0" r="0" t="0"/>
-            <wp:docPr id="2" name="image4.png"/>
+            <wp:docPr id="4" name="image3.png"/>
             <a:graphic>
               <a:graphicData uri="http://schemas.openxmlformats.org/drawingml/2006/picture">
                 <pic:pic>
                   <pic:nvPicPr>
-                    <pic:cNvPr id="0" name="image4.png"/>
+                    <pic:cNvPr id="0" name="image3.png"/>
                     <pic:cNvPicPr preferRelativeResize="0"/>
                   </pic:nvPicPr>
                   <pic:blipFill>
@@ -460,7 +672,7 @@
                   <pic:spPr>
                     <a:xfrm>
                       <a:off x="0" y="0"/>
-                      <a:ext cx="5731200" cy="6375400"/>
+                      <a:ext cx="5214938" cy="1446669"/>
                     </a:xfrm>
                     <a:prstGeom prst="rect"/>
                     <a:ln/>
@@ -473,29 +685,131 @@
       </w:r>
       <w:r>
         <w:rPr>
-          <w:rFonts w:ascii="Aptos" w:cs="Aptos" w:eastAsia="Aptos" w:hAnsi="Aptos"/>
-          <w:sz w:val="24"/>
-          <w:szCs w:val="24"/>
-          <w:rtl w:val="0"/>
-        </w:rPr>
-        <w:t xml:space="preserve"> </w:t>
-      </w:r>
-      <w:r>
-        <w:rPr>
-          <w:rFonts w:ascii="Aptos" w:cs="Aptos" w:eastAsia="Aptos" w:hAnsi="Aptos"/>
-          <w:sz w:val="24"/>
-          <w:szCs w:val="24"/>
-        </w:rPr>
+          <w:rtl w:val="0"/>
+        </w:rPr>
+      </w:r>
+    </w:p>
+    <w:p>
+      <w:pPr>
+        <w:spacing w:after="240" w:before="240" w:line="279" w:lineRule="auto"/>
+        <w:rPr>
+          <w:rFonts w:ascii="Aptos" w:cs="Aptos" w:eastAsia="Aptos" w:hAnsi="Aptos"/>
+          <w:sz w:val="24"/>
+          <w:szCs w:val="24"/>
+        </w:rPr>
+      </w:pPr>
+      <w:r>
+        <w:rPr>
+          <w:rtl w:val="0"/>
+        </w:rPr>
+      </w:r>
+    </w:p>
+    <w:p>
+      <w:pPr>
+        <w:spacing w:after="240" w:before="240" w:line="279" w:lineRule="auto"/>
+        <w:rPr>
+          <w:rFonts w:ascii="Aptos" w:cs="Aptos" w:eastAsia="Aptos" w:hAnsi="Aptos"/>
+          <w:b w:val="1"/>
+          <w:bCs w:val="1"/>
+          <w:i w:val="1"/>
+          <w:iCs w:val="1"/>
+          <w:sz w:val="24"/>
+          <w:szCs w:val="24"/>
+        </w:rPr>
+      </w:pPr>
+      <w:r>
+        <w:rPr>
+          <w:rFonts w:ascii="Aptos" w:cs="Aptos" w:eastAsia="Aptos" w:hAnsi="Aptos"/>
+          <w:sz w:val="24"/>
+          <w:szCs w:val="24"/>
+          <w:rtl w:val="0"/>
+        </w:rPr>
+        <w:t xml:space="preserve">-En el requerimiento 3  </w:t>
+      </w:r>
+      <w:r>
+        <w:rPr>
+          <w:rFonts w:ascii="Aptos" w:cs="Aptos" w:eastAsia="Aptos" w:hAnsi="Aptos"/>
+          <w:b w:val="1"/>
+          <w:bCs w:val="1"/>
+          <w:i w:val="1"/>
+          <w:iCs w:val="1"/>
+          <w:sz w:val="24"/>
+          <w:szCs w:val="24"/>
+          <w:rtl w:val="0"/>
+        </w:rPr>
+        <w:t xml:space="preserve">timer</w:t>
+      </w:r>
+      <w:r>
+        <w:rPr>
+          <w:rFonts w:ascii="Aptos" w:cs="Aptos" w:eastAsia="Aptos" w:hAnsi="Aptos"/>
+          <w:i w:val="1"/>
+          <w:iCs w:val="1"/>
+          <w:sz w:val="24"/>
+          <w:szCs w:val="24"/>
+          <w:rtl w:val="0"/>
+        </w:rPr>
+        <w:t xml:space="preserve">  </w:t>
+      </w:r>
+      <w:r>
+        <w:rPr>
+          <w:rFonts w:ascii="Aptos" w:cs="Aptos" w:eastAsia="Aptos" w:hAnsi="Aptos"/>
+          <w:sz w:val="24"/>
+          <w:szCs w:val="24"/>
+          <w:rtl w:val="0"/>
+        </w:rPr>
+        <w:t xml:space="preserve">se añadieron los intermitentes y se sumaron los 3 segundos de cada intermitente al timestamp.  Las posiciones pasaron de </w:t>
+      </w:r>
+      <w:r>
+        <w:rPr>
+          <w:rFonts w:ascii="Aptos" w:cs="Aptos" w:eastAsia="Aptos" w:hAnsi="Aptos"/>
+          <w:b w:val="1"/>
+          <w:bCs w:val="1"/>
+          <w:i w:val="1"/>
+          <w:iCs w:val="1"/>
+          <w:sz w:val="24"/>
+          <w:szCs w:val="24"/>
+          <w:rtl w:val="0"/>
+        </w:rPr>
+        <w:t xml:space="preserve">216 -&gt; 225</w:t>
+      </w:r>
+    </w:p>
+    <w:p>
+      <w:pPr>
+        <w:spacing w:after="240" w:before="240" w:line="279" w:lineRule="auto"/>
+        <w:rPr>
+          <w:rFonts w:ascii="Aptos" w:cs="Aptos" w:eastAsia="Aptos" w:hAnsi="Aptos"/>
+          <w:b w:val="1"/>
+          <w:bCs w:val="1"/>
+          <w:i w:val="1"/>
+          <w:iCs w:val="1"/>
+          <w:sz w:val="24"/>
+          <w:szCs w:val="24"/>
+        </w:rPr>
+      </w:pPr>
+      <w:r>
+        <w:rPr>
+          <w:rtl w:val="0"/>
+        </w:rPr>
+      </w:r>
+      <w:r>
         <w:drawing>
-          <wp:inline distB="114300" distT="114300" distL="114300" distR="114300">
-            <wp:extent cx="5731200" cy="3378200"/>
+          <wp:anchor allowOverlap="1" behindDoc="0" distB="114300" distT="114300" distL="114300" distR="114300" hidden="0" layoutInCell="1" locked="0" relativeHeight="0" simplePos="0">
+            <wp:simplePos x="0" y="0"/>
+            <wp:positionH relativeFrom="column">
+              <wp:posOffset>19051</wp:posOffset>
+            </wp:positionH>
+            <wp:positionV relativeFrom="paragraph">
+              <wp:posOffset>114300</wp:posOffset>
+            </wp:positionV>
+            <wp:extent cx="4605338" cy="2092539"/>
             <wp:effectExtent b="0" l="0" r="0" t="0"/>
-            <wp:docPr id="3" name="image1.png"/>
+            <wp:wrapSquare wrapText="bothSides" distB="114300" distT="114300" distL="114300" distR="114300"/>
+            <wp:docPr id="2" name="image4.png"/>
             <a:graphic>
               <a:graphicData uri="http://schemas.openxmlformats.org/drawingml/2006/picture">
                 <pic:pic>
                   <pic:nvPicPr>
-                    <pic:cNvPr id="0" name="image1.png"/>
+                    <pic:cNvPr id="0" name="image4.png"/>
                     <pic:cNvPicPr preferRelativeResize="0"/>
                   </pic:nvPicPr>
                   <pic:blipFill>
@@ -508,7 +822,157 @@
                   <pic:spPr>
                     <a:xfrm>
                       <a:off x="0" y="0"/>
-                      <a:ext cx="5731200" cy="3378200"/>
+                      <a:ext cx="4605338" cy="2092539"/>
+                    </a:xfrm>
+                    <a:prstGeom prst="rect"/>
+                    <a:ln/>
+                  </pic:spPr>
+                </pic:pic>
+              </a:graphicData>
+            </a:graphic>
+          </wp:anchor>
+        </w:drawing>
+      </w:r>
+    </w:p>
+    <w:p>
+      <w:pPr>
+        <w:spacing w:after="240" w:before="240" w:line="279" w:lineRule="auto"/>
+        <w:rPr>
+          <w:rFonts w:ascii="Aptos" w:cs="Aptos" w:eastAsia="Aptos" w:hAnsi="Aptos"/>
+          <w:sz w:val="24"/>
+          <w:szCs w:val="24"/>
+        </w:rPr>
+      </w:pPr>
+      <w:r>
+        <w:rPr>
+          <w:rtl w:val="0"/>
+        </w:rPr>
+      </w:r>
+    </w:p>
+    <w:p>
+      <w:pPr>
+        <w:spacing w:after="240" w:before="240" w:line="279" w:lineRule="auto"/>
+        <w:rPr>
+          <w:rFonts w:ascii="Aptos" w:cs="Aptos" w:eastAsia="Aptos" w:hAnsi="Aptos"/>
+          <w:sz w:val="24"/>
+          <w:szCs w:val="24"/>
+        </w:rPr>
+      </w:pPr>
+      <w:r>
+        <w:rPr>
+          <w:rtl w:val="0"/>
+        </w:rPr>
+      </w:r>
+    </w:p>
+    <w:p>
+      <w:pPr>
+        <w:spacing w:after="240" w:before="240" w:line="279" w:lineRule="auto"/>
+        <w:rPr>
+          <w:rFonts w:ascii="Aptos" w:cs="Aptos" w:eastAsia="Aptos" w:hAnsi="Aptos"/>
+          <w:sz w:val="24"/>
+          <w:szCs w:val="24"/>
+        </w:rPr>
+      </w:pPr>
+      <w:r>
+        <w:rPr>
+          <w:rtl w:val="0"/>
+        </w:rPr>
+      </w:r>
+    </w:p>
+    <w:p>
+      <w:pPr>
+        <w:spacing w:after="240" w:before="240" w:line="279" w:lineRule="auto"/>
+        <w:rPr>
+          <w:rFonts w:ascii="Aptos" w:cs="Aptos" w:eastAsia="Aptos" w:hAnsi="Aptos"/>
+          <w:sz w:val="24"/>
+          <w:szCs w:val="24"/>
+        </w:rPr>
+      </w:pPr>
+      <w:r>
+        <w:rPr>
+          <w:rtl w:val="0"/>
+        </w:rPr>
+      </w:r>
+    </w:p>
+    <w:p>
+      <w:pPr>
+        <w:spacing w:after="240" w:before="240" w:line="279" w:lineRule="auto"/>
+        <w:rPr>
+          <w:rFonts w:ascii="Aptos" w:cs="Aptos" w:eastAsia="Aptos" w:hAnsi="Aptos"/>
+          <w:sz w:val="24"/>
+          <w:szCs w:val="24"/>
+        </w:rPr>
+      </w:pPr>
+      <w:r>
+        <w:rPr>
+          <w:rFonts w:ascii="Aptos" w:cs="Aptos" w:eastAsia="Aptos" w:hAnsi="Aptos"/>
+          <w:sz w:val="24"/>
+          <w:szCs w:val="24"/>
+          <w:rtl w:val="0"/>
+        </w:rPr>
+        <w:t xml:space="preserve">-En el requerimiento 6 </w:t>
+      </w:r>
+      <w:r>
+        <w:rPr>
+          <w:rFonts w:ascii="Aptos" w:cs="Aptos" w:eastAsia="Aptos" w:hAnsi="Aptos"/>
+          <w:b w:val="1"/>
+          <w:bCs w:val="1"/>
+          <w:i w:val="1"/>
+          <w:iCs w:val="1"/>
+          <w:sz w:val="24"/>
+          <w:szCs w:val="24"/>
+          <w:rtl w:val="0"/>
+        </w:rPr>
+        <w:t xml:space="preserve">distribucion-temporal </w:t>
+      </w:r>
+      <w:r>
+        <w:rPr>
+          <w:rFonts w:ascii="Aptos" w:cs="Aptos" w:eastAsia="Aptos" w:hAnsi="Aptos"/>
+          <w:sz w:val="24"/>
+          <w:szCs w:val="24"/>
+          <w:rtl w:val="0"/>
+        </w:rPr>
+        <w:t xml:space="preserve">se añadieron los 3 intermitentes para que también calcule el porcentaje de tiempo de los colores intermitentes.</w:t>
+      </w:r>
+    </w:p>
+    <w:p>
+      <w:pPr>
+        <w:spacing w:after="240" w:before="240" w:line="279" w:lineRule="auto"/>
+        <w:rPr>
+          <w:rFonts w:ascii="Aptos" w:cs="Aptos" w:eastAsia="Aptos" w:hAnsi="Aptos"/>
+          <w:sz w:val="24"/>
+          <w:szCs w:val="24"/>
+        </w:rPr>
+      </w:pPr>
+      <w:r>
+        <w:rPr>
+          <w:rFonts w:ascii="Aptos" w:cs="Aptos" w:eastAsia="Aptos" w:hAnsi="Aptos"/>
+          <w:sz w:val="24"/>
+          <w:szCs w:val="24"/>
+        </w:rPr>
+        <w:drawing>
+          <wp:inline distB="114300" distT="114300" distL="114300" distR="114300">
+            <wp:extent cx="3862388" cy="4292255"/>
+            <wp:effectExtent b="0" l="0" r="0" t="0"/>
+            <wp:docPr id="3" name="image2.png"/>
+            <a:graphic>
+              <a:graphicData uri="http://schemas.openxmlformats.org/drawingml/2006/picture">
+                <pic:pic>
+                  <pic:nvPicPr>
+                    <pic:cNvPr id="0" name="image2.png"/>
+                    <pic:cNvPicPr preferRelativeResize="0"/>
+                  </pic:nvPicPr>
+                  <pic:blipFill>
+                    <a:blip r:embed="rId10"/>
+                    <a:srcRect b="0" l="0" r="0" t="0"/>
+                    <a:stretch>
+                      <a:fillRect/>
+                    </a:stretch>
+                  </pic:blipFill>
+                  <pic:spPr>
+                    <a:xfrm>
+                      <a:off x="0" y="0"/>
+                      <a:ext cx="3862388" cy="4292255"/>
                     </a:xfrm>
                     <a:prstGeom prst="rect"/>
                     <a:ln/>
@@ -519,6 +983,69 @@
           </wp:inline>
         </w:drawing>
       </w:r>
+      <w:r>
+        <w:rPr>
+          <w:rFonts w:ascii="Aptos" w:cs="Aptos" w:eastAsia="Aptos" w:hAnsi="Aptos"/>
+          <w:sz w:val="24"/>
+          <w:szCs w:val="24"/>
+          <w:rtl w:val="0"/>
+        </w:rPr>
+        <w:t xml:space="preserve"> </w:t>
+      </w:r>
+      <w:r>
+        <w:rPr>
+          <w:rFonts w:ascii="Aptos" w:cs="Aptos" w:eastAsia="Aptos" w:hAnsi="Aptos"/>
+          <w:sz w:val="24"/>
+          <w:szCs w:val="24"/>
+        </w:rPr>
+        <w:drawing>
+          <wp:inline distB="114300" distT="114300" distL="114300" distR="114300">
+            <wp:extent cx="4976813" cy="2289995"/>
+            <wp:effectExtent b="0" l="0" r="0" t="0"/>
+            <wp:docPr id="5" name="image1.png"/>
+            <a:graphic>
+              <a:graphicData uri="http://schemas.openxmlformats.org/drawingml/2006/picture">
+                <pic:pic>
+                  <pic:nvPicPr>
+                    <pic:cNvPr id="0" name="image1.png"/>
+                    <pic:cNvPicPr preferRelativeResize="0"/>
+                  </pic:nvPicPr>
+                  <pic:blipFill>
+                    <a:blip r:embed="rId11"/>
+                    <a:srcRect b="0" l="0" r="0" t="0"/>
+                    <a:stretch>
+                      <a:fillRect/>
+                    </a:stretch>
+                  </pic:blipFill>
+                  <pic:spPr>
+                    <a:xfrm>
+                      <a:off x="0" y="0"/>
+                      <a:ext cx="4976813" cy="2289995"/>
+                    </a:xfrm>
+                    <a:prstGeom prst="rect"/>
+                    <a:ln/>
+                  </pic:spPr>
+                </pic:pic>
+              </a:graphicData>
+            </a:graphic>
+          </wp:inline>
+        </w:drawing>
+      </w:r>
+      <w:r>
+        <w:rPr>
+          <w:rtl w:val="0"/>
+        </w:rPr>
+      </w:r>
+    </w:p>
+    <w:p>
+      <w:pPr>
+        <w:spacing w:after="240" w:before="240" w:line="279" w:lineRule="auto"/>
+        <w:rPr>
+          <w:rFonts w:ascii="Aptos" w:cs="Aptos" w:eastAsia="Aptos" w:hAnsi="Aptos"/>
+          <w:sz w:val="24"/>
+          <w:szCs w:val="24"/>
+        </w:rPr>
+      </w:pPr>
       <w:r>
         <w:rPr>
           <w:rtl w:val="0"/>

</xml_diff>

<commit_message>
actualización con el orden de los colores arreglados
</commit_message>
<xml_diff>
--- a/docs/Informe Iteración 2 Extensión 1 - Aegerter Sebastián.docx
+++ b/docs/Informe Iteración 2 Extensión 1 - Aegerter Sebastián.docx
@@ -652,14 +652,14 @@
         </w:rPr>
         <w:drawing>
           <wp:inline distB="114300" distT="114300" distL="114300" distR="114300">
-            <wp:extent cx="5214938" cy="1446669"/>
+            <wp:extent cx="5731200" cy="1485900"/>
             <wp:effectExtent b="0" l="0" r="0" t="0"/>
-            <wp:docPr id="4" name="image3.png"/>
+            <wp:docPr id="2" name="image2.png"/>
             <a:graphic>
               <a:graphicData uri="http://schemas.openxmlformats.org/drawingml/2006/picture">
                 <pic:pic>
                   <pic:nvPicPr>
-                    <pic:cNvPr id="0" name="image3.png"/>
+                    <pic:cNvPr id="0" name="image2.png"/>
                     <pic:cNvPicPr preferRelativeResize="0"/>
                   </pic:nvPicPr>
                   <pic:blipFill>
@@ -672,7 +672,7 @@
                   <pic:spPr>
                     <a:xfrm>
                       <a:off x="0" y="0"/>
-                      <a:ext cx="5214938" cy="1446669"/>
+                      <a:ext cx="5731200" cy="1485900"/>
                     </a:xfrm>
                     <a:prstGeom prst="rect"/>
                     <a:ln/>
@@ -793,7 +793,7 @@
       </w:r>
       <w:r>
         <w:drawing>
-          <wp:anchor allowOverlap="1" behindDoc="0" distB="114300" distT="114300" distL="114300" distR="114300" hidden="0" layoutInCell="1" locked="0" relativeHeight="0" simplePos="0">
+          <wp:anchor allowOverlap="1" behindDoc="1" distB="114300" distT="114300" distL="114300" distR="114300" hidden="0" layoutInCell="1" locked="0" relativeHeight="0" simplePos="0">
             <wp:simplePos x="0" y="0"/>
             <wp:positionH relativeFrom="column">
               <wp:posOffset>19051</wp:posOffset>
@@ -801,15 +801,15 @@
             <wp:positionV relativeFrom="paragraph">
               <wp:posOffset>114300</wp:posOffset>
             </wp:positionV>
-            <wp:extent cx="4605338" cy="2092539"/>
+            <wp:extent cx="4643438" cy="2100801"/>
             <wp:effectExtent b="0" l="0" r="0" t="0"/>
-            <wp:wrapSquare wrapText="bothSides" distB="114300" distT="114300" distL="114300" distR="114300"/>
-            <wp:docPr id="2" name="image4.png"/>
+            <wp:wrapNone/>
+            <wp:docPr id="5" name="image3.png"/>
             <a:graphic>
               <a:graphicData uri="http://schemas.openxmlformats.org/drawingml/2006/picture">
                 <pic:pic>
                   <pic:nvPicPr>
-                    <pic:cNvPr id="0" name="image4.png"/>
+                    <pic:cNvPr id="0" name="image3.png"/>
                     <pic:cNvPicPr preferRelativeResize="0"/>
                   </pic:nvPicPr>
                   <pic:blipFill>
@@ -822,7 +822,7 @@
                   <pic:spPr>
                     <a:xfrm>
                       <a:off x="0" y="0"/>
-                      <a:ext cx="4605338" cy="2092539"/>
+                      <a:ext cx="4643438" cy="2100801"/>
                     </a:xfrm>
                     <a:prstGeom prst="rect"/>
                     <a:ln/>
@@ -952,14 +952,14 @@
         </w:rPr>
         <w:drawing>
           <wp:inline distB="114300" distT="114300" distL="114300" distR="114300">
-            <wp:extent cx="3862388" cy="4292255"/>
+            <wp:extent cx="4033838" cy="3971925"/>
             <wp:effectExtent b="0" l="0" r="0" t="0"/>
-            <wp:docPr id="3" name="image2.png"/>
+            <wp:docPr id="4" name="image4.png"/>
             <a:graphic>
               <a:graphicData uri="http://schemas.openxmlformats.org/drawingml/2006/picture">
                 <pic:pic>
                   <pic:nvPicPr>
-                    <pic:cNvPr id="0" name="image2.png"/>
+                    <pic:cNvPr id="0" name="image4.png"/>
                     <pic:cNvPicPr preferRelativeResize="0"/>
                   </pic:nvPicPr>
                   <pic:blipFill>
@@ -972,7 +972,7 @@
                   <pic:spPr>
                     <a:xfrm>
                       <a:off x="0" y="0"/>
-                      <a:ext cx="3862388" cy="4292255"/>
+                      <a:ext cx="4033838" cy="3971925"/>
                     </a:xfrm>
                     <a:prstGeom prst="rect"/>
                     <a:ln/>
@@ -1000,9 +1000,9 @@
         </w:rPr>
         <w:drawing>
           <wp:inline distB="114300" distT="114300" distL="114300" distR="114300">
-            <wp:extent cx="4976813" cy="2289995"/>
+            <wp:extent cx="5486049" cy="3298920"/>
             <wp:effectExtent b="0" l="0" r="0" t="0"/>
-            <wp:docPr id="5" name="image1.png"/>
+            <wp:docPr id="3" name="image1.png"/>
             <a:graphic>
               <a:graphicData uri="http://schemas.openxmlformats.org/drawingml/2006/picture">
                 <pic:pic>
@@ -1020,7 +1020,7 @@
                   <pic:spPr>
                     <a:xfrm>
                       <a:off x="0" y="0"/>
-                      <a:ext cx="4976813" cy="2289995"/>
+                      <a:ext cx="5486049" cy="3298920"/>
                     </a:xfrm>
                     <a:prstGeom prst="rect"/>
                     <a:ln/>

</xml_diff>